<commit_message>
finalize the project and add presentation
</commit_message>
<xml_diff>
--- a/docs/Specification Document.docx
+++ b/docs/Specification Document.docx
@@ -56,6 +56,9 @@
     <w:p>
       <w:pPr>
         <w:jc w:val="center"/>
+        <w:rPr>
+          <w:sz w:val="22"/>
+        </w:rPr>
       </w:pPr>
       <w:r>
         <w:rPr>
@@ -64,6 +67,26 @@
         <w:br/>
         <w:t xml:space="preserve">Prepared by: </w:t>
       </w:r>
+    </w:p>
+    <w:p>
+      <w:pPr>
+        <w:pStyle w:val="aa"/>
+        <w:numPr>
+          <w:ilvl w:val="0"/>
+          <w:numId w:val="16"/>
+        </w:numPr>
+        <w:jc w:val="center"/>
+      </w:pPr>
+    </w:p>
+    <w:p>
+      <w:pPr>
+        <w:pStyle w:val="aa"/>
+        <w:numPr>
+          <w:ilvl w:val="0"/>
+          <w:numId w:val="16"/>
+        </w:numPr>
+        <w:jc w:val="center"/>
+      </w:pPr>
       <w:r>
         <w:rPr>
           <w:sz w:val="22"/>
@@ -5908,7 +5931,7 @@
           <w:ilvl w:val="0"/>
           <w:numId w:val="0"/>
         </w:numPr>
-        <w:ind w:left="360"/>
+        <w:ind w:left="360" w:hanging="360"/>
       </w:pPr>
     </w:p>
     <w:p>
@@ -5918,8 +5941,49 @@
           <w:ilvl w:val="0"/>
           <w:numId w:val="0"/>
         </w:numPr>
-        <w:ind w:left="360"/>
-      </w:pPr>
+        <w:ind w:left="360" w:hanging="360"/>
+      </w:pPr>
+      <w:r>
+        <w:rPr>
+          <w:noProof/>
+        </w:rPr>
+        <w:lastRenderedPageBreak/>
+        <w:drawing>
+          <wp:inline distT="0" distB="0" distL="0" distR="0" wp14:anchorId="44773E2A" wp14:editId="16E25C61">
+            <wp:extent cx="6309360" cy="4669155"/>
+            <wp:effectExtent l="0" t="0" r="0" b="0"/>
+            <wp:docPr id="16" name="صورة 16"/>
+            <wp:cNvGraphicFramePr>
+              <a:graphicFrameLocks xmlns:a="http://schemas.openxmlformats.org/drawingml/2006/main" noChangeAspect="1"/>
+            </wp:cNvGraphicFramePr>
+            <a:graphic xmlns:a="http://schemas.openxmlformats.org/drawingml/2006/main">
+              <a:graphicData uri="http://schemas.openxmlformats.org/drawingml/2006/picture">
+                <pic:pic xmlns:pic="http://schemas.openxmlformats.org/drawingml/2006/picture">
+                  <pic:nvPicPr>
+                    <pic:cNvPr id="1" name=""/>
+                    <pic:cNvPicPr/>
+                  </pic:nvPicPr>
+                  <pic:blipFill>
+                    <a:blip r:embed="rId10"/>
+                    <a:stretch>
+                      <a:fillRect/>
+                    </a:stretch>
+                  </pic:blipFill>
+                  <pic:spPr>
+                    <a:xfrm>
+                      <a:off x="0" y="0"/>
+                      <a:ext cx="6309360" cy="4669155"/>
+                    </a:xfrm>
+                    <a:prstGeom prst="rect">
+                      <a:avLst/>
+                    </a:prstGeom>
+                  </pic:spPr>
+                </pic:pic>
+              </a:graphicData>
+            </a:graphic>
+          </wp:inline>
+        </w:drawing>
+      </w:r>
     </w:p>
     <w:p>
       <w:pPr>
@@ -5928,7 +5992,7 @@
           <w:ilvl w:val="0"/>
           <w:numId w:val="0"/>
         </w:numPr>
-        <w:ind w:left="360"/>
+        <w:ind w:left="360" w:hanging="360"/>
       </w:pPr>
     </w:p>
     <w:p>
@@ -5938,7 +6002,7 @@
           <w:ilvl w:val="0"/>
           <w:numId w:val="0"/>
         </w:numPr>
-        <w:ind w:left="360"/>
+        <w:ind w:left="360" w:hanging="360"/>
       </w:pPr>
     </w:p>
     <w:p>
@@ -5948,7 +6012,33 @@
           <w:ilvl w:val="0"/>
           <w:numId w:val="0"/>
         </w:numPr>
-        <w:ind w:left="360"/>
+      </w:pPr>
+    </w:p>
+    <w:p>
+      <w:pPr>
+        <w:pStyle w:val="a0"/>
+        <w:numPr>
+          <w:ilvl w:val="0"/>
+          <w:numId w:val="0"/>
+        </w:numPr>
+      </w:pPr>
+    </w:p>
+    <w:p>
+      <w:pPr>
+        <w:pStyle w:val="a0"/>
+        <w:numPr>
+          <w:ilvl w:val="0"/>
+          <w:numId w:val="0"/>
+        </w:numPr>
+      </w:pPr>
+    </w:p>
+    <w:p>
+      <w:pPr>
+        <w:pStyle w:val="a0"/>
+        <w:numPr>
+          <w:ilvl w:val="0"/>
+          <w:numId w:val="0"/>
+        </w:numPr>
       </w:pPr>
     </w:p>
     <w:p>
@@ -5959,7 +6049,6 @@
         <w:rPr>
           <w:rFonts w:ascii="Aptos Display" w:hAnsi="Aptos Display"/>
         </w:rPr>
-        <w:lastRenderedPageBreak/>
         <w:t>13. User Interface Pages</w:t>
       </w:r>
     </w:p>
@@ -6171,6 +6260,7 @@
         <w:rPr>
           <w:rFonts w:ascii="Aptos Display" w:hAnsi="Aptos Display"/>
         </w:rPr>
+        <w:lastRenderedPageBreak/>
         <w:t>1</w:t>
       </w:r>
       <w:r>
@@ -7021,7 +7111,6 @@
               <w:rPr>
                 <w:sz w:val="20"/>
               </w:rPr>
-              <w:lastRenderedPageBreak/>
               <w:t>Add modals and UX improvements</w:t>
             </w:r>
           </w:p>
@@ -7119,7 +7208,11 @@
     </w:p>
     <w:p>
       <w:r>
-        <w:t>Smart Lost &amp; Found demonstrates a complete AWS cloud solution that solves a real university problem using a serverless architecture. The system includes authentication, role-based authorization, active APIs, database storage, image storage, AI-based image analysis, notifications, monitoring, and scheduled automation. The project also shows a clear business workflow from reporting an item to claiming it and marking it as returned.</w:t>
+        <w:t xml:space="preserve">Smart Lost &amp; Found demonstrates a complete AWS cloud solution that solves a real university problem using a serverless architecture. The system includes authentication, role-based authorization, active APIs, database </w:t>
+      </w:r>
+      <w:r>
+        <w:lastRenderedPageBreak/>
+        <w:t>storage, image storage, AI-based image analysis, notifications, monitoring, and scheduled automation. The project also shows a clear business workflow from reporting an item to claiming it and marking it as returned.</w:t>
       </w:r>
     </w:p>
     <w:p>
@@ -7162,7 +7255,7 @@
     <w:p/>
     <w:p/>
     <w:sectPr>
-      <w:footerReference w:type="default" r:id="rId10"/>
+      <w:footerReference w:type="default" r:id="rId11"/>
       <w:pgSz w:w="12240" w:h="15840"/>
       <w:pgMar w:top="1080" w:right="1152" w:bottom="1080" w:left="1152" w:header="720" w:footer="720" w:gutter="0"/>
       <w:cols w:space="720"/>
@@ -7967,6 +8060,96 @@
     </w:lvl>
   </w:abstractNum>
   <w:abstractNum w:abstractNumId="13" w15:restartNumberingAfterBreak="0">
+    <w:nsid w:val="51B60936"/>
+    <w:multiLevelType w:val="hybridMultilevel"/>
+    <w:tmpl w:val="5FCA27CA"/>
+    <w:lvl w:ilvl="0" w:tplc="EDDEDB0E">
+      <w:start w:val="1"/>
+      <w:numFmt w:val="decimal"/>
+      <w:lvlText w:val="%1-"/>
+      <w:lvlJc w:val="left"/>
+      <w:pPr>
+        <w:ind w:left="720" w:hanging="360"/>
+      </w:pPr>
+      <w:rPr>
+        <w:rFonts w:hint="default"/>
+        <w:sz w:val="22"/>
+      </w:rPr>
+    </w:lvl>
+    <w:lvl w:ilvl="1" w:tplc="04090019" w:tentative="1">
+      <w:start w:val="1"/>
+      <w:numFmt w:val="lowerLetter"/>
+      <w:lvlText w:val="%2."/>
+      <w:lvlJc w:val="left"/>
+      <w:pPr>
+        <w:ind w:left="1440" w:hanging="360"/>
+      </w:pPr>
+    </w:lvl>
+    <w:lvl w:ilvl="2" w:tplc="0409001B" w:tentative="1">
+      <w:start w:val="1"/>
+      <w:numFmt w:val="lowerRoman"/>
+      <w:lvlText w:val="%3."/>
+      <w:lvlJc w:val="right"/>
+      <w:pPr>
+        <w:ind w:left="2160" w:hanging="180"/>
+      </w:pPr>
+    </w:lvl>
+    <w:lvl w:ilvl="3" w:tplc="0409000F" w:tentative="1">
+      <w:start w:val="1"/>
+      <w:numFmt w:val="decimal"/>
+      <w:lvlText w:val="%4."/>
+      <w:lvlJc w:val="left"/>
+      <w:pPr>
+        <w:ind w:left="2880" w:hanging="360"/>
+      </w:pPr>
+    </w:lvl>
+    <w:lvl w:ilvl="4" w:tplc="04090019" w:tentative="1">
+      <w:start w:val="1"/>
+      <w:numFmt w:val="lowerLetter"/>
+      <w:lvlText w:val="%5."/>
+      <w:lvlJc w:val="left"/>
+      <w:pPr>
+        <w:ind w:left="3600" w:hanging="360"/>
+      </w:pPr>
+    </w:lvl>
+    <w:lvl w:ilvl="5" w:tplc="0409001B" w:tentative="1">
+      <w:start w:val="1"/>
+      <w:numFmt w:val="lowerRoman"/>
+      <w:lvlText w:val="%6."/>
+      <w:lvlJc w:val="right"/>
+      <w:pPr>
+        <w:ind w:left="4320" w:hanging="180"/>
+      </w:pPr>
+    </w:lvl>
+    <w:lvl w:ilvl="6" w:tplc="0409000F" w:tentative="1">
+      <w:start w:val="1"/>
+      <w:numFmt w:val="decimal"/>
+      <w:lvlText w:val="%7."/>
+      <w:lvlJc w:val="left"/>
+      <w:pPr>
+        <w:ind w:left="5040" w:hanging="360"/>
+      </w:pPr>
+    </w:lvl>
+    <w:lvl w:ilvl="7" w:tplc="04090019" w:tentative="1">
+      <w:start w:val="1"/>
+      <w:numFmt w:val="lowerLetter"/>
+      <w:lvlText w:val="%8."/>
+      <w:lvlJc w:val="left"/>
+      <w:pPr>
+        <w:ind w:left="5760" w:hanging="360"/>
+      </w:pPr>
+    </w:lvl>
+    <w:lvl w:ilvl="8" w:tplc="0409001B" w:tentative="1">
+      <w:start w:val="1"/>
+      <w:numFmt w:val="lowerRoman"/>
+      <w:lvlText w:val="%9."/>
+      <w:lvlJc w:val="right"/>
+      <w:pPr>
+        <w:ind w:left="6480" w:hanging="180"/>
+      </w:pPr>
+    </w:lvl>
+  </w:abstractNum>
+  <w:abstractNum w:abstractNumId="14" w15:restartNumberingAfterBreak="0">
     <w:nsid w:val="666922EC"/>
     <w:multiLevelType w:val="multilevel"/>
     <w:tmpl w:val="F110749A"/>
@@ -8115,7 +8298,7 @@
       </w:rPr>
     </w:lvl>
   </w:abstractNum>
-  <w:abstractNum w:abstractNumId="14" w15:restartNumberingAfterBreak="0">
+  <w:abstractNum w:abstractNumId="15" w15:restartNumberingAfterBreak="0">
     <w:nsid w:val="7D352745"/>
     <w:multiLevelType w:val="multilevel"/>
     <w:tmpl w:val="5D641786"/>
@@ -8304,10 +8487,13 @@
     <w:abstractNumId w:val="11"/>
   </w:num>
   <w:num w:numId="14" w16cid:durableId="1238781665">
-    <w:abstractNumId w:val="13"/>
+    <w:abstractNumId w:val="14"/>
   </w:num>
   <w:num w:numId="15" w16cid:durableId="1591809846">
-    <w:abstractNumId w:val="14"/>
+    <w:abstractNumId w:val="15"/>
+  </w:num>
+  <w:num w:numId="16" w16cid:durableId="957444179">
+    <w:abstractNumId w:val="13"/>
   </w:num>
 </w:numbering>
 </file>

</xml_diff>